<commit_message>
Add schematic view and update documentation
</commit_message>
<xml_diff>
--- a/docs/Arduino_projekt_dokumentacio_Slezák_Gábor_o6kji9.docx
+++ b/docs/Arduino_projekt_dokumentacio_Slezák_Gábor_o6kji9.docx
@@ -304,7 +304,7 @@
       <w:pPr>
         <w:pStyle w:val="szdcmsortartalomjegyzk"/>
       </w:pPr>
-      <w:bookmarkStart w:id="0" w:name="_Toc230464973"/>
+      <w:bookmarkStart w:id="0" w:name="_Toc230471923"/>
       <w:r>
         <w:lastRenderedPageBreak/>
         <w:t>Tartalomjegyzék</w:t>
@@ -383,7 +383,7 @@
             </w:rPr>
             <w:fldChar w:fldCharType="separate"/>
           </w:r>
-          <w:hyperlink w:anchor="_Toc230464973" w:history="1">
+          <w:hyperlink w:anchor="_Toc230471923" w:history="1">
             <w:r>
               <w:rPr>
                 <w:rStyle w:val="Hyperlink"/>
@@ -410,7 +410,7 @@
                 <w:noProof/>
                 <w:webHidden/>
               </w:rPr>
-              <w:instrText xml:space="preserve"> PAGEREF _Toc230464973 \h </w:instrText>
+              <w:instrText xml:space="preserve"> PAGEREF _Toc230471923 \h </w:instrText>
             </w:r>
             <w:r>
               <w:rPr>
@@ -457,7 +457,7 @@
               <w14:ligatures w14:val="standardContextual"/>
             </w:rPr>
           </w:pPr>
-          <w:hyperlink w:anchor="_Toc230464974" w:history="1">
+          <w:hyperlink w:anchor="_Toc230471924" w:history="1">
             <w:r>
               <w:rPr>
                 <w:rStyle w:val="Hyperlink"/>
@@ -484,7 +484,7 @@
                 <w:noProof/>
                 <w:webHidden/>
               </w:rPr>
-              <w:instrText xml:space="preserve"> PAGEREF _Toc230464974 \h </w:instrText>
+              <w:instrText xml:space="preserve"> PAGEREF _Toc230471924 \h </w:instrText>
             </w:r>
             <w:r>
               <w:rPr>
@@ -533,7 +533,7 @@
               <w14:ligatures w14:val="standardContextual"/>
             </w:rPr>
           </w:pPr>
-          <w:hyperlink w:anchor="_Toc230464975" w:history="1">
+          <w:hyperlink w:anchor="_Toc230471925" w:history="1">
             <w:r>
               <w:rPr>
                 <w:rStyle w:val="Hyperlink"/>
@@ -580,7 +580,7 @@
                 <w:noProof/>
                 <w:webHidden/>
               </w:rPr>
-              <w:instrText xml:space="preserve"> PAGEREF _Toc230464975 \h </w:instrText>
+              <w:instrText xml:space="preserve"> PAGEREF _Toc230471925 \h </w:instrText>
             </w:r>
             <w:r>
               <w:rPr>
@@ -629,7 +629,7 @@
               <w14:ligatures w14:val="standardContextual"/>
             </w:rPr>
           </w:pPr>
-          <w:hyperlink w:anchor="_Toc230464976" w:history="1">
+          <w:hyperlink w:anchor="_Toc230471926" w:history="1">
             <w:r>
               <w:rPr>
                 <w:rStyle w:val="Hyperlink"/>
@@ -676,7 +676,7 @@
                 <w:noProof/>
                 <w:webHidden/>
               </w:rPr>
-              <w:instrText xml:space="preserve"> PAGEREF _Toc230464976 \h </w:instrText>
+              <w:instrText xml:space="preserve"> PAGEREF _Toc230471926 \h </w:instrText>
             </w:r>
             <w:r>
               <w:rPr>
@@ -725,7 +725,7 @@
               <w14:ligatures w14:val="standardContextual"/>
             </w:rPr>
           </w:pPr>
-          <w:hyperlink w:anchor="_Toc230464977" w:history="1">
+          <w:hyperlink w:anchor="_Toc230471927" w:history="1">
             <w:r>
               <w:rPr>
                 <w:rStyle w:val="Hyperlink"/>
@@ -772,7 +772,7 @@
                 <w:noProof/>
                 <w:webHidden/>
               </w:rPr>
-              <w:instrText xml:space="preserve"> PAGEREF _Toc230464977 \h </w:instrText>
+              <w:instrText xml:space="preserve"> PAGEREF _Toc230471927 \h </w:instrText>
             </w:r>
             <w:r>
               <w:rPr>
@@ -822,7 +822,7 @@
               <w14:ligatures w14:val="standardContextual"/>
             </w:rPr>
           </w:pPr>
-          <w:hyperlink w:anchor="_Toc230464978" w:history="1">
+          <w:hyperlink w:anchor="_Toc230471928" w:history="1">
             <w:r>
               <w:rPr>
                 <w:rStyle w:val="Hyperlink"/>
@@ -871,7 +871,7 @@
                 <w:noProof/>
                 <w:webHidden/>
               </w:rPr>
-              <w:instrText xml:space="preserve"> PAGEREF _Toc230464978 \h </w:instrText>
+              <w:instrText xml:space="preserve"> PAGEREF _Toc230471928 \h </w:instrText>
             </w:r>
             <w:r>
               <w:rPr>
@@ -921,7 +921,7 @@
               <w14:ligatures w14:val="standardContextual"/>
             </w:rPr>
           </w:pPr>
-          <w:hyperlink w:anchor="_Toc230464979" w:history="1">
+          <w:hyperlink w:anchor="_Toc230471929" w:history="1">
             <w:r>
               <w:rPr>
                 <w:rStyle w:val="Hyperlink"/>
@@ -970,7 +970,7 @@
                 <w:noProof/>
                 <w:webHidden/>
               </w:rPr>
-              <w:instrText xml:space="preserve"> PAGEREF _Toc230464979 \h </w:instrText>
+              <w:instrText xml:space="preserve"> PAGEREF _Toc230471929 \h </w:instrText>
             </w:r>
             <w:r>
               <w:rPr>
@@ -1019,7 +1019,7 @@
               <w14:ligatures w14:val="standardContextual"/>
             </w:rPr>
           </w:pPr>
-          <w:hyperlink w:anchor="_Toc230464980" w:history="1">
+          <w:hyperlink w:anchor="_Toc230471930" w:history="1">
             <w:r>
               <w:rPr>
                 <w:rStyle w:val="Hyperlink"/>
@@ -1066,7 +1066,7 @@
                 <w:noProof/>
                 <w:webHidden/>
               </w:rPr>
-              <w:instrText xml:space="preserve"> PAGEREF _Toc230464980 \h </w:instrText>
+              <w:instrText xml:space="preserve"> PAGEREF _Toc230471930 \h </w:instrText>
             </w:r>
             <w:r>
               <w:rPr>
@@ -1115,7 +1115,7 @@
               <w14:ligatures w14:val="standardContextual"/>
             </w:rPr>
           </w:pPr>
-          <w:hyperlink w:anchor="_Toc230464981" w:history="1">
+          <w:hyperlink w:anchor="_Toc230471931" w:history="1">
             <w:r>
               <w:rPr>
                 <w:rStyle w:val="Hyperlink"/>
@@ -1162,7 +1162,7 @@
                 <w:noProof/>
                 <w:webHidden/>
               </w:rPr>
-              <w:instrText xml:space="preserve"> PAGEREF _Toc230464981 \h </w:instrText>
+              <w:instrText xml:space="preserve"> PAGEREF _Toc230471931 \h </w:instrText>
             </w:r>
             <w:r>
               <w:rPr>
@@ -1182,7 +1182,7 @@
                 <w:noProof/>
                 <w:webHidden/>
               </w:rPr>
-              <w:t>7</w:t>
+              <w:t>8</w:t>
             </w:r>
             <w:r>
               <w:rPr>
@@ -1211,7 +1211,7 @@
               <w14:ligatures w14:val="standardContextual"/>
             </w:rPr>
           </w:pPr>
-          <w:hyperlink w:anchor="_Toc230464982" w:history="1">
+          <w:hyperlink w:anchor="_Toc230471932" w:history="1">
             <w:r>
               <w:rPr>
                 <w:rStyle w:val="Hyperlink"/>
@@ -1258,7 +1258,7 @@
                 <w:noProof/>
                 <w:webHidden/>
               </w:rPr>
-              <w:instrText xml:space="preserve"> PAGEREF _Toc230464982 \h </w:instrText>
+              <w:instrText xml:space="preserve"> PAGEREF _Toc230471932 \h </w:instrText>
             </w:r>
             <w:r>
               <w:rPr>
@@ -1278,7 +1278,7 @@
                 <w:noProof/>
                 <w:webHidden/>
               </w:rPr>
-              <w:t>8</w:t>
+              <w:t>9</w:t>
             </w:r>
             <w:r>
               <w:rPr>
@@ -1308,7 +1308,7 @@
               <w14:ligatures w14:val="standardContextual"/>
             </w:rPr>
           </w:pPr>
-          <w:hyperlink w:anchor="_Toc230464983" w:history="1">
+          <w:hyperlink w:anchor="_Toc230471933" w:history="1">
             <w:r>
               <w:rPr>
                 <w:rStyle w:val="Hyperlink"/>
@@ -1356,7 +1356,7 @@
                 <w:noProof/>
                 <w:webHidden/>
               </w:rPr>
-              <w:instrText xml:space="preserve"> PAGEREF _Toc230464983 \h </w:instrText>
+              <w:instrText xml:space="preserve"> PAGEREF _Toc230471933 \h </w:instrText>
             </w:r>
             <w:r>
               <w:rPr>
@@ -1376,7 +1376,7 @@
                 <w:noProof/>
                 <w:webHidden/>
               </w:rPr>
-              <w:t>8</w:t>
+              <w:t>9</w:t>
             </w:r>
             <w:r>
               <w:rPr>
@@ -1405,7 +1405,7 @@
               <w14:ligatures w14:val="standardContextual"/>
             </w:rPr>
           </w:pPr>
-          <w:hyperlink w:anchor="_Toc230464984" w:history="1">
+          <w:hyperlink w:anchor="_Toc230471934" w:history="1">
             <w:r>
               <w:rPr>
                 <w:rStyle w:val="Hyperlink"/>
@@ -1456,7 +1456,7 @@
                 <w:noProof/>
                 <w:webHidden/>
               </w:rPr>
-              <w:instrText xml:space="preserve"> PAGEREF _Toc230464984 \h </w:instrText>
+              <w:instrText xml:space="preserve"> PAGEREF _Toc230471934 \h </w:instrText>
             </w:r>
             <w:r>
               <w:rPr>
@@ -1476,7 +1476,7 @@
                 <w:noProof/>
                 <w:webHidden/>
               </w:rPr>
-              <w:t>9</w:t>
+              <w:t>10</w:t>
             </w:r>
             <w:r>
               <w:rPr>
@@ -1506,7 +1506,7 @@
               <w14:ligatures w14:val="standardContextual"/>
             </w:rPr>
           </w:pPr>
-          <w:hyperlink w:anchor="_Toc230464985" w:history="1">
+          <w:hyperlink w:anchor="_Toc230471935" w:history="1">
             <w:r>
               <w:rPr>
                 <w:rStyle w:val="Hyperlink"/>
@@ -1556,7 +1556,7 @@
                 <w:noProof/>
                 <w:webHidden/>
               </w:rPr>
-              <w:instrText xml:space="preserve"> PAGEREF _Toc230464985 \h </w:instrText>
+              <w:instrText xml:space="preserve"> PAGEREF _Toc230471935 \h </w:instrText>
             </w:r>
             <w:r>
               <w:rPr>
@@ -1576,7 +1576,7 @@
                 <w:noProof/>
                 <w:webHidden/>
               </w:rPr>
-              <w:t>9</w:t>
+              <w:t>10</w:t>
             </w:r>
             <w:r>
               <w:rPr>
@@ -1605,7 +1605,7 @@
               <w14:ligatures w14:val="standardContextual"/>
             </w:rPr>
           </w:pPr>
-          <w:hyperlink w:anchor="_Toc230464986" w:history="1">
+          <w:hyperlink w:anchor="_Toc230471936" w:history="1">
             <w:r>
               <w:rPr>
                 <w:rStyle w:val="Hyperlink"/>
@@ -1652,7 +1652,7 @@
                 <w:noProof/>
                 <w:webHidden/>
               </w:rPr>
-              <w:instrText xml:space="preserve"> PAGEREF _Toc230464986 \h </w:instrText>
+              <w:instrText xml:space="preserve"> PAGEREF _Toc230471936 \h </w:instrText>
             </w:r>
             <w:r>
               <w:rPr>
@@ -1672,7 +1672,7 @@
                 <w:noProof/>
                 <w:webHidden/>
               </w:rPr>
-              <w:t>10</w:t>
+              <w:t>11</w:t>
             </w:r>
             <w:r>
               <w:rPr>
@@ -1702,7 +1702,7 @@
               <w14:ligatures w14:val="standardContextual"/>
             </w:rPr>
           </w:pPr>
-          <w:hyperlink w:anchor="_Toc230464987" w:history="1">
+          <w:hyperlink w:anchor="_Toc230471937" w:history="1">
             <w:r>
               <w:rPr>
                 <w:rStyle w:val="Hyperlink"/>
@@ -1750,7 +1750,7 @@
                 <w:noProof/>
                 <w:webHidden/>
               </w:rPr>
-              <w:instrText xml:space="preserve"> PAGEREF _Toc230464987 \h </w:instrText>
+              <w:instrText xml:space="preserve"> PAGEREF _Toc230471937 \h </w:instrText>
             </w:r>
             <w:r>
               <w:rPr>
@@ -1770,7 +1770,7 @@
                 <w:noProof/>
                 <w:webHidden/>
               </w:rPr>
-              <w:t>10</w:t>
+              <w:t>11</w:t>
             </w:r>
             <w:r>
               <w:rPr>
@@ -1799,7 +1799,7 @@
               <w14:ligatures w14:val="standardContextual"/>
             </w:rPr>
           </w:pPr>
-          <w:hyperlink w:anchor="_Toc230464988" w:history="1">
+          <w:hyperlink w:anchor="_Toc230471938" w:history="1">
             <w:r>
               <w:rPr>
                 <w:rStyle w:val="Hyperlink"/>
@@ -1846,7 +1846,7 @@
                 <w:noProof/>
                 <w:webHidden/>
               </w:rPr>
-              <w:instrText xml:space="preserve"> PAGEREF _Toc230464988 \h </w:instrText>
+              <w:instrText xml:space="preserve"> PAGEREF _Toc230471938 \h </w:instrText>
             </w:r>
             <w:r>
               <w:rPr>
@@ -1866,7 +1866,7 @@
                 <w:noProof/>
                 <w:webHidden/>
               </w:rPr>
-              <w:t>11</w:t>
+              <w:t>12</w:t>
             </w:r>
             <w:r>
               <w:rPr>
@@ -1896,7 +1896,7 @@
               <w14:ligatures w14:val="standardContextual"/>
             </w:rPr>
           </w:pPr>
-          <w:hyperlink w:anchor="_Toc230464989" w:history="1">
+          <w:hyperlink w:anchor="_Toc230471939" w:history="1">
             <w:r>
               <w:rPr>
                 <w:rStyle w:val="Hyperlink"/>
@@ -1945,7 +1945,7 @@
                 <w:noProof/>
                 <w:webHidden/>
               </w:rPr>
-              <w:instrText xml:space="preserve"> PAGEREF _Toc230464989 \h </w:instrText>
+              <w:instrText xml:space="preserve"> PAGEREF _Toc230471939 \h </w:instrText>
             </w:r>
             <w:r>
               <w:rPr>
@@ -1965,7 +1965,7 @@
                 <w:noProof/>
                 <w:webHidden/>
               </w:rPr>
-              <w:t>12</w:t>
+              <w:t>13</w:t>
             </w:r>
             <w:r>
               <w:rPr>
@@ -1995,7 +1995,7 @@
               <w14:ligatures w14:val="standardContextual"/>
             </w:rPr>
           </w:pPr>
-          <w:hyperlink w:anchor="_Toc230464990" w:history="1">
+          <w:hyperlink w:anchor="_Toc230471940" w:history="1">
             <w:r>
               <w:rPr>
                 <w:rStyle w:val="Hyperlink"/>
@@ -2044,7 +2044,7 @@
                 <w:noProof/>
                 <w:webHidden/>
               </w:rPr>
-              <w:instrText xml:space="preserve"> PAGEREF _Toc230464990 \h </w:instrText>
+              <w:instrText xml:space="preserve"> PAGEREF _Toc230471940 \h </w:instrText>
             </w:r>
             <w:r>
               <w:rPr>
@@ -2064,7 +2064,7 @@
                 <w:noProof/>
                 <w:webHidden/>
               </w:rPr>
-              <w:t>13</w:t>
+              <w:t>14</w:t>
             </w:r>
             <w:r>
               <w:rPr>
@@ -2099,7 +2099,7 @@
       <w:pPr>
         <w:pStyle w:val="szdcmsorszmozatlan"/>
       </w:pPr>
-      <w:bookmarkStart w:id="1" w:name="_Toc230464974"/>
+      <w:bookmarkStart w:id="1" w:name="_Toc230471924"/>
       <w:r>
         <w:lastRenderedPageBreak/>
         <w:t>Projekt leí</w:t>
@@ -2202,7 +2202,7 @@
       <w:pPr>
         <w:pStyle w:val="szdcmsor2"/>
       </w:pPr>
-      <w:bookmarkStart w:id="2" w:name="_Toc230464975"/>
+      <w:bookmarkStart w:id="2" w:name="_Toc230471925"/>
       <w:r>
         <w:t>Az okos beléptető use-case:</w:t>
       </w:r>
@@ -2744,7 +2744,7 @@
       <w:pPr>
         <w:pStyle w:val="szdcmsor2"/>
       </w:pPr>
-      <w:bookmarkStart w:id="3" w:name="_Toc230464976"/>
+      <w:bookmarkStart w:id="3" w:name="_Toc230471926"/>
       <w:r>
         <w:t>Funkciók megvalósítása:</w:t>
       </w:r>
@@ -2878,7 +2878,7 @@
       <w:pPr>
         <w:pStyle w:val="szdcmsor2"/>
       </w:pPr>
-      <w:bookmarkStart w:id="4" w:name="_Toc230464977"/>
+      <w:bookmarkStart w:id="4" w:name="_Toc230471927"/>
       <w:r>
         <w:lastRenderedPageBreak/>
         <w:t>Folyamatábra:</w:t>
@@ -2940,7 +2940,7 @@
       <w:pPr>
         <w:pStyle w:val="szdcmsor1"/>
       </w:pPr>
-      <w:bookmarkStart w:id="5" w:name="_Toc230464978"/>
+      <w:bookmarkStart w:id="5" w:name="_Toc230471928"/>
       <w:r>
         <w:lastRenderedPageBreak/>
         <w:t>Állapotgép működése</w:t>
@@ -3324,7 +3324,7 @@
       <w:pPr>
         <w:pStyle w:val="szdcmsor1"/>
       </w:pPr>
-      <w:bookmarkStart w:id="6" w:name="_Toc230464979"/>
+      <w:bookmarkStart w:id="6" w:name="_Toc230471929"/>
       <w:r>
         <w:lastRenderedPageBreak/>
         <w:t>Tinkercad részletek</w:t>
@@ -3333,9 +3333,61 @@
     </w:p>
     <w:p>
       <w:pPr>
+        <w:pStyle w:val="szdszveg"/>
+        <w:ind w:firstLine="0"/>
+      </w:pPr>
+      <w:r>
+        <w:rPr>
+          <w:noProof/>
+        </w:rPr>
+        <w:drawing>
+          <wp:inline distT="0" distB="0" distL="0" distR="0" wp14:anchorId="1BBD102C" wp14:editId="62A4D4E6">
+            <wp:extent cx="5579110" cy="4236720"/>
+            <wp:effectExtent l="0" t="0" r="2540" b="0"/>
+            <wp:docPr id="1873351268" name="Picture 1"/>
+            <wp:cNvGraphicFramePr>
+              <a:graphicFrameLocks xmlns:a="http://schemas.openxmlformats.org/drawingml/2006/main" noChangeAspect="1"/>
+            </wp:cNvGraphicFramePr>
+            <a:graphic xmlns:a="http://schemas.openxmlformats.org/drawingml/2006/main">
+              <a:graphicData uri="http://schemas.openxmlformats.org/drawingml/2006/picture">
+                <pic:pic xmlns:pic="http://schemas.openxmlformats.org/drawingml/2006/picture">
+                  <pic:nvPicPr>
+                    <pic:cNvPr id="1873351268" name="Picture 1873351268"/>
+                    <pic:cNvPicPr/>
+                  </pic:nvPicPr>
+                  <pic:blipFill>
+                    <a:blip r:embed="rId15" cstate="print">
+                      <a:extLst>
+                        <a:ext uri="{28A0092B-C50C-407E-A947-70E740481C1C}">
+                          <a14:useLocalDpi xmlns:a14="http://schemas.microsoft.com/office/drawing/2010/main" val="0"/>
+                        </a:ext>
+                      </a:extLst>
+                    </a:blip>
+                    <a:stretch>
+                      <a:fillRect/>
+                    </a:stretch>
+                  </pic:blipFill>
+                  <pic:spPr>
+                    <a:xfrm>
+                      <a:off x="0" y="0"/>
+                      <a:ext cx="5579110" cy="4236720"/>
+                    </a:xfrm>
+                    <a:prstGeom prst="rect">
+                      <a:avLst/>
+                    </a:prstGeom>
+                  </pic:spPr>
+                </pic:pic>
+              </a:graphicData>
+            </a:graphic>
+          </wp:inline>
+        </w:drawing>
+      </w:r>
+    </w:p>
+    <w:p>
+      <w:pPr>
         <w:pStyle w:val="szdcmsor2"/>
       </w:pPr>
-      <w:bookmarkStart w:id="7" w:name="_Toc230464980"/>
+      <w:bookmarkStart w:id="7" w:name="_Toc230471930"/>
       <w:r>
         <w:t>Fő komponensek:</w:t>
       </w:r>
@@ -3429,8 +3481,9 @@
       <w:pPr>
         <w:pStyle w:val="szdcmsor2"/>
       </w:pPr>
-      <w:bookmarkStart w:id="8" w:name="_Toc230464981"/>
-      <w:r>
+      <w:bookmarkStart w:id="8" w:name="_Toc230471931"/>
+      <w:r>
+        <w:lastRenderedPageBreak/>
         <w:t>LCD kijelzés megvalósítása:</w:t>
       </w:r>
       <w:bookmarkEnd w:id="8"/>
@@ -3459,7 +3512,7 @@
                     <pic:cNvPicPr/>
                   </pic:nvPicPr>
                   <pic:blipFill>
-                    <a:blip r:embed="rId15">
+                    <a:blip r:embed="rId16">
                       <a:extLst>
                         <a:ext uri="{28A0092B-C50C-407E-A947-70E740481C1C}">
                           <a14:useLocalDpi xmlns:a14="http://schemas.microsoft.com/office/drawing/2010/main" val="0"/>
@@ -3721,8 +3774,9 @@
       <w:pPr>
         <w:pStyle w:val="szdcmsor2"/>
       </w:pPr>
-      <w:bookmarkStart w:id="9" w:name="_Toc230464982"/>
-      <w:r>
+      <w:bookmarkStart w:id="9" w:name="_Toc230471932"/>
+      <w:r>
+        <w:lastRenderedPageBreak/>
         <w:t>KeyPad bekötése:</w:t>
       </w:r>
       <w:bookmarkEnd w:id="9"/>
@@ -3752,7 +3806,7 @@
                     <pic:cNvPicPr/>
                   </pic:nvPicPr>
                   <pic:blipFill>
-                    <a:blip r:embed="rId16">
+                    <a:blip r:embed="rId17">
                       <a:extLst>
                         <a:ext uri="{28A0092B-C50C-407E-A947-70E740481C1C}">
                           <a14:useLocalDpi xmlns:a14="http://schemas.microsoft.com/office/drawing/2010/main" val="0"/>
@@ -4000,12 +4054,9 @@
       <w:pPr>
         <w:pStyle w:val="szdcmsor3"/>
       </w:pPr>
-      <w:bookmarkStart w:id="10" w:name="_Toc230464983"/>
-      <w:r>
-        <w:t>P</w:t>
-      </w:r>
-      <w:r>
-        <w:t>IN-kezelés megvalósítása Keypaddel:</w:t>
+      <w:bookmarkStart w:id="10" w:name="_Toc230471933"/>
+      <w:r>
+        <w:t>PIN-kezelés megvalósítása Keypaddel:</w:t>
       </w:r>
       <w:bookmarkEnd w:id="10"/>
     </w:p>
@@ -4085,7 +4136,7 @@
           <w:lang w:val="en-US"/>
         </w:rPr>
       </w:pPr>
-      <w:bookmarkStart w:id="11" w:name="_Toc230464984"/>
+      <w:bookmarkStart w:id="11" w:name="_Toc230471934"/>
       <w:proofErr w:type="spellStart"/>
       <w:r>
         <w:rPr>
@@ -4166,7 +4217,7 @@
                     <pic:cNvPicPr/>
                   </pic:nvPicPr>
                   <pic:blipFill>
-                    <a:blip r:embed="rId17">
+                    <a:blip r:embed="rId18">
                       <a:extLst>
                         <a:ext uri="{28A0092B-C50C-407E-A947-70E740481C1C}">
                           <a14:useLocalDpi xmlns:a14="http://schemas.microsoft.com/office/drawing/2010/main" val="0"/>
@@ -4438,7 +4489,7 @@
           <w:lang w:val="en-US"/>
         </w:rPr>
       </w:pPr>
-      <w:bookmarkStart w:id="12" w:name="_Toc230464985"/>
+      <w:bookmarkStart w:id="12" w:name="_Toc230471935"/>
       <w:proofErr w:type="spellStart"/>
       <w:r>
         <w:rPr>
@@ -4997,7 +5048,7 @@
       <w:pPr>
         <w:pStyle w:val="szdcmsor2"/>
       </w:pPr>
-      <w:bookmarkStart w:id="13" w:name="_Toc230464986"/>
+      <w:bookmarkStart w:id="13" w:name="_Toc230471936"/>
       <w:r>
         <w:lastRenderedPageBreak/>
         <w:t>Ablakzár: Micro Servo - PushButton bekötése:</w:t>
@@ -5028,7 +5079,7 @@
                     <pic:cNvPicPr/>
                   </pic:nvPicPr>
                   <pic:blipFill>
-                    <a:blip r:embed="rId18">
+                    <a:blip r:embed="rId19">
                       <a:extLst>
                         <a:ext uri="{28A0092B-C50C-407E-A947-70E740481C1C}">
                           <a14:useLocalDpi xmlns:a14="http://schemas.microsoft.com/office/drawing/2010/main" val="0"/>
@@ -5072,6 +5123,7 @@
         <w:tc>
           <w:tcPr>
             <w:tcW w:w="1755" w:type="dxa"/>
+            <w:shd w:val="clear" w:color="auto" w:fill="D9D9D9" w:themeFill="background1" w:themeFillShade="D9"/>
           </w:tcPr>
           <w:p>
             <w:r>
@@ -5082,6 +5134,7 @@
         <w:tc>
           <w:tcPr>
             <w:tcW w:w="1755" w:type="dxa"/>
+            <w:shd w:val="clear" w:color="auto" w:fill="D9D9D9" w:themeFill="background1" w:themeFillShade="D9"/>
           </w:tcPr>
           <w:p>
             <w:r>
@@ -5092,6 +5145,7 @@
         <w:tc>
           <w:tcPr>
             <w:tcW w:w="1755" w:type="dxa"/>
+            <w:shd w:val="clear" w:color="auto" w:fill="D9D9D9" w:themeFill="background1" w:themeFillShade="D9"/>
           </w:tcPr>
           <w:p>
             <w:r>
@@ -5102,6 +5156,7 @@
         <w:tc>
           <w:tcPr>
             <w:tcW w:w="1755" w:type="dxa"/>
+            <w:shd w:val="clear" w:color="auto" w:fill="D9D9D9" w:themeFill="background1" w:themeFillShade="D9"/>
           </w:tcPr>
           <w:p>
             <w:r>
@@ -5112,6 +5167,7 @@
         <w:tc>
           <w:tcPr>
             <w:tcW w:w="1756" w:type="dxa"/>
+            <w:shd w:val="clear" w:color="auto" w:fill="D9D9D9" w:themeFill="background1" w:themeFillShade="D9"/>
           </w:tcPr>
           <w:p>
             <w:r>
@@ -5445,7 +5501,7 @@
       <w:pPr>
         <w:pStyle w:val="szdcmsor3"/>
       </w:pPr>
-      <w:bookmarkStart w:id="14" w:name="_Toc230464987"/>
+      <w:bookmarkStart w:id="14" w:name="_Toc230471937"/>
       <w:r>
         <w:t>Ablakvezérlés megvalósítása Micro Servo és PushButton segítségével:</w:t>
       </w:r>
@@ -5501,7 +5557,7 @@
       <w:pPr>
         <w:pStyle w:val="szdcmsor2"/>
       </w:pPr>
-      <w:bookmarkStart w:id="15" w:name="_Toc230464988"/>
+      <w:bookmarkStart w:id="15" w:name="_Toc230471938"/>
       <w:r>
         <w:lastRenderedPageBreak/>
         <w:t>Esőérzékelés</w:t>
@@ -5579,7 +5635,7 @@
       <w:pPr>
         <w:pStyle w:val="szdcmsor1"/>
       </w:pPr>
-      <w:bookmarkStart w:id="16" w:name="_Toc230464989"/>
+      <w:bookmarkStart w:id="16" w:name="_Toc230471939"/>
       <w:r>
         <w:lastRenderedPageBreak/>
         <w:t>Tesztesetek:</w:t>
@@ -5883,7 +5939,7 @@
       <w:pPr>
         <w:pStyle w:val="szdcmsor1"/>
       </w:pPr>
-      <w:bookmarkStart w:id="17" w:name="_Toc230464990"/>
+      <w:bookmarkStart w:id="17" w:name="_Toc230471940"/>
       <w:r>
         <w:lastRenderedPageBreak/>
         <w:t>Továbbfejlesztési lehetőségek:</w:t>
@@ -5939,8 +5995,8 @@
       </w:r>
     </w:p>
     <w:sectPr>
-      <w:footerReference w:type="default" r:id="rId19"/>
-      <w:footerReference w:type="first" r:id="rId20"/>
+      <w:footerReference w:type="default" r:id="rId20"/>
+      <w:footerReference w:type="first" r:id="rId21"/>
       <w:pgSz w:w="11906" w:h="16838" w:code="9"/>
       <w:pgMar w:top="1418" w:right="1418" w:bottom="1418" w:left="1418" w:header="709" w:footer="709" w:gutter="284"/>
       <w:pgNumType w:start="1"/>
@@ -9738,6 +9794,7 @@
   <w:style w:type="character" w:default="1" w:styleId="DefaultParagraphFont">
     <w:name w:val="Default Paragraph Font"/>
     <w:uiPriority w:val="1"/>
+    <w:semiHidden/>
     <w:unhideWhenUsed/>
   </w:style>
   <w:style w:type="table" w:default="1" w:styleId="TableNormal">

</xml_diff>